<commit_message>
docs: independent confirmation of the WSL2/offload bug on Blackwell (vLLM 0.27.1)
New comment on vllm-project/vllm#37883 (2026-08-12) reports the identical
failure mode — cpu-offload-gb + WSL2 crashing MoE warmup with illegal
memory access, fixed by disabling offload entirely — on a stack sharing
nothing with this project's own: vLLM 0.27.1 (~20 releases ahead of our
0.6.6.post1), PyTorch 2.13.0+cu130, an RTX 5090 (Blackwell/SM120), and a
different model family (NemotronH, not Mixtral). Both Marlin and the
newer Humming MoE backend affected.

Adds this to §8 (Related Work) in the report (md + both docx, EN/IT) —
strengthens the "structural WSL2 limitation, not our stack" conclusion
with evidence spanning three GPU generations and two model architectures,
and reinforces that the EAT/Tier-Manager approach in §9 (not waiting on
an upstream fix) is the right call.

Co-Authored-By: Claude Sonnet 5 <noreply@anthropic.com>
</commit_message>
<xml_diff>
--- a/osx-poc/reports/gcsg_shadow_execution_report_EN.docx
+++ b/osx-poc/reports/gcsg_shadow_execution_report_EN.docx
@@ -2098,7 +2098,7 @@
         </w:rPr>
         <w:t xml:space="preserve">, unlike the bypass in §4 — performs its CPU→GPU swap-in over pageable host memory because vLLM disables pinned memory under WSL2. This is slow and highly variable, but not incorrect and not a hang. Cross-checked against vLLM's own upstream issue tracker before accepting a "must be a WSL2 problem" conclusion: </w:t>
       </w:r>
-      <w:hyperlink w:history="1" r:id="rIdogtnhzkk0aiguiiofefkx">
+      <w:hyperlink w:history="1" r:id="rIdfu_z3z0sxadk_8y89q0wy">
         <w:r>
           <w:rPr>
             <w:rStyle w:val="Hyperlink"/>
@@ -2113,7 +2113,7 @@
         </w:rPr>
         <w:t xml:space="preserve"> has a vLLM maintainer stating this is "unavoidable" on WSL, citing NVIDIA's own CUDA-on-WSL documentation; more strikingly, </w:t>
       </w:r>
-      <w:hyperlink w:history="1" r:id="rIdq7oxcvtp8ve4mekithyuo">
+      <w:hyperlink w:history="1" r:id="rIdqxkc7dmzmfi7fo650pltk">
         <w:r>
           <w:rPr>
             <w:rStyle w:val="Hyperlink"/>
@@ -2998,7 +2998,7 @@
         </w:numPr>
         <w:spacing w:after="80"/>
       </w:pPr>
-      <w:hyperlink w:history="1" r:id="rId9sjbjhufbhq73pygsfqwq">
+      <w:hyperlink w:history="1" r:id="rIdvqjtffoamr8sowwxmw6nf">
         <w:r>
           <w:rPr>
             <w:rStyle w:val="Hyperlink"/>
@@ -3023,7 +3023,7 @@
         </w:numPr>
         <w:spacing w:after="80"/>
       </w:pPr>
-      <w:hyperlink w:history="1" r:id="rIdnrksiuwpastipx4fupp78">
+      <w:hyperlink w:history="1" r:id="rIdfxo4qukjok5xyga2_e6do">
         <w:r>
           <w:rPr>
             <w:rStyle w:val="Hyperlink"/>
@@ -3066,7 +3066,66 @@
         <w:rPr>
           <w:rFonts w:ascii="Calibri" w:cs="Calibri" w:eastAsia="Calibri" w:hAnsi="Calibri"/>
         </w:rPr>
-        <w:t xml:space="preserve"> mechanism causing an outright crash in a different (UVA/NVFP4) offload path, on a much newer vLLM release, closed not_planned. This project's wrapper-granularity finding (§4) was added there as a comment during this investigation.</w:t>
+        <w:t xml:space="preserve"> mechanism causing an outright crash in a different (UVA/NVFP4) offload path, on a much newer vLLM release, closed not_planned. This project's wrapper-granularity finding (§4) was added there as a comment during this investigation. </w:t>
+      </w:r>
+      <w:r>
+        <w:rPr>
+          <w:rFonts w:ascii="Calibri" w:cs="Calibri" w:eastAsia="Calibri" w:hAnsi="Calibri"/>
+          <w:b/>
+          <w:bCs/>
+        </w:rPr>
+        <w:t xml:space="preserve">Update (2026-08-12):</w:t>
+      </w:r>
+      <w:r>
+        <w:rPr>
+          <w:rFonts w:ascii="Calibri" w:cs="Calibri" w:eastAsia="Calibri" w:hAnsi="Calibri"/>
+        </w:rPr>
+        <w:t xml:space="preserve"> an independent reporter confirmed the identical failure mode still reproduces on a stack with essentially nothing in common with this project's own — vLLM 0.27.1, PyTorch 2.13.0+cu130, an RTX 5090 (Blackwell, SM120, 24GB), and a different model family entirely (</w:t>
+      </w:r>
+      <w:r>
+        <w:rPr>
+          <w:rFonts w:ascii="Consolas" w:cs="Consolas" w:eastAsia="Consolas" w:hAnsi="Consolas"/>
+          <w:sz w:val="20"/>
+          <w:szCs w:val="20"/>
+          <w:shd w:fill="EFEFEF" w:val="clear"/>
+        </w:rPr>
+        <w:t xml:space="preserve">nvidia/NVIDIA-Nemotron-3.5-Lightning-30B-A3B-NVFP4</w:t>
+      </w:r>
+      <w:r>
+        <w:rPr>
+          <w:rFonts w:ascii="Calibri" w:cs="Calibri" w:eastAsia="Calibri" w:hAnsi="Calibri"/>
+        </w:rPr>
+        <w:t xml:space="preserve">, hybrid NemotronH, not Mixtral). Same trigger (</w:t>
+      </w:r>
+      <w:r>
+        <w:rPr>
+          <w:rFonts w:ascii="Consolas" w:cs="Consolas" w:eastAsia="Consolas" w:hAnsi="Consolas"/>
+          <w:sz w:val="20"/>
+          <w:szCs w:val="20"/>
+          <w:shd w:fill="EFEFEF" w:val="clear"/>
+        </w:rPr>
+        <w:t xml:space="preserve">--cpu-offload-gb 4</w:t>
+      </w:r>
+      <w:r>
+        <w:rPr>
+          <w:rFonts w:ascii="Calibri" w:cs="Calibri" w:eastAsia="Calibri" w:hAnsi="Calibri"/>
+        </w:rPr>
+        <w:t xml:space="preserve">, Marlin *and* the newer Humming MoE backend both affected), same fix (</w:t>
+      </w:r>
+      <w:r>
+        <w:rPr>
+          <w:rFonts w:ascii="Consolas" w:cs="Consolas" w:eastAsia="Consolas" w:hAnsi="Consolas"/>
+          <w:sz w:val="20"/>
+          <w:szCs w:val="20"/>
+          <w:shd w:fill="EFEFEF" w:val="clear"/>
+        </w:rPr>
+        <w:t xml:space="preserve">--cpu-offload-gb 0</w:t>
+      </w:r>
+      <w:r>
+        <w:rPr>
+          <w:rFonts w:ascii="Calibri" w:cs="Calibri" w:eastAsia="Calibri" w:hAnsi="Calibri"/>
+        </w:rPr>
+        <w:t xml:space="preserve">, everything GPU-resident). This is now confirmed across ~20 vLLM releases, three GPU generations (Ampere to Ada to Blackwell), and two unrelated model architectures — strengthens §5's conclusion that this is a structural WSL2 platform limitation, not specific to this project's stack, and that waiting for an upstream fix (rather than the EAT/Tier-Manager-mediated approach in §9) is not a viable path.</w:t>
       </w:r>
     </w:p>
     <w:p>
@@ -3614,7 +3673,7 @@
         </w:rPr>
         <w:t xml:space="preserve">Issues: </w:t>
       </w:r>
-      <w:hyperlink w:history="1" r:id="rIddxoo1rwmtfskweupcjnao">
+      <w:hyperlink w:history="1" r:id="rIdfnoscutgd9of8jm7z8rto">
         <w:r>
           <w:rPr>
             <w:rStyle w:val="Hyperlink"/>
@@ -3629,7 +3688,7 @@
         </w:rPr>
         <w:t xml:space="preserve">, </w:t>
       </w:r>
-      <w:hyperlink w:history="1" r:id="rIduyflsptawfiy5kzww4gye">
+      <w:hyperlink w:history="1" r:id="rIdrsbo1cu_5wy-ekim5qcg8">
         <w:r>
           <w:rPr>
             <w:rStyle w:val="Hyperlink"/>

</xml_diff>

<commit_message>
docs: close the §9 pinning-strategy question with the soak test result
The GCSG report's §9 correction explicitly flagged manual pin_memory
safety-under-load as unanswered. Answered: 1000-cycle soak test on real
Linux (RunPod, Sprint 4), 0 mismatches, no degradation. Updated in the
md and both docx (EN/IT) — same "Update" pattern used for the vLLM
upstream corroboration earlier this sprint.

Co-Authored-By: Claude Sonnet 5 <noreply@anthropic.com>
</commit_message>
<xml_diff>
--- a/osx-poc/reports/gcsg_shadow_execution_report_EN.docx
+++ b/osx-poc/reports/gcsg_shadow_execution_report_EN.docx
@@ -2098,7 +2098,7 @@
         </w:rPr>
         <w:t xml:space="preserve">, unlike the bypass in §4 — performs its CPU→GPU swap-in over pageable host memory because vLLM disables pinned memory under WSL2. This is slow and highly variable, but not incorrect and not a hang. Cross-checked against vLLM's own upstream issue tracker before accepting a "must be a WSL2 problem" conclusion: </w:t>
       </w:r>
-      <w:hyperlink w:history="1" r:id="rIdfu_z3z0sxadk_8y89q0wy">
+      <w:hyperlink w:history="1" r:id="rId4elhz2axn13kolpyd521o">
         <w:r>
           <w:rPr>
             <w:rStyle w:val="Hyperlink"/>
@@ -2113,7 +2113,7 @@
         </w:rPr>
         <w:t xml:space="preserve"> has a vLLM maintainer stating this is "unavoidable" on WSL, citing NVIDIA's own CUDA-on-WSL documentation; more strikingly, </w:t>
       </w:r>
-      <w:hyperlink w:history="1" r:id="rIdqxkc7dmzmfi7fo650pltk">
+      <w:hyperlink w:history="1" r:id="rIdjizzt8zjsoiwt6gjpd0ef">
         <w:r>
           <w:rPr>
             <w:rStyle w:val="Hyperlink"/>
@@ -2998,7 +2998,7 @@
         </w:numPr>
         <w:spacing w:after="80"/>
       </w:pPr>
-      <w:hyperlink w:history="1" r:id="rIdvqjtffoamr8sowwxmw6nf">
+      <w:hyperlink w:history="1" r:id="rId15cuwzd5xns2cr6ra9wxn">
         <w:r>
           <w:rPr>
             <w:rStyle w:val="Hyperlink"/>
@@ -3023,7 +3023,7 @@
         </w:numPr>
         <w:spacing w:after="80"/>
       </w:pPr>
-      <w:hyperlink w:history="1" r:id="rIdfxo4qukjok5xyga2_e6do">
+      <w:hyperlink w:history="1" r:id="rId56k_onzhyftax-6faf5_d">
         <w:r>
           <w:rPr>
             <w:rStyle w:val="Hyperlink"/>
@@ -3292,7 +3292,21 @@
         <w:rPr>
           <w:rFonts w:ascii="Calibri" w:cs="Calibri" w:eastAsia="Calibri" w:hAnsi="Calibri"/>
         </w:rPr>
-        <w:t xml:space="preserve">) exists, but was never soak-tested. This needs its own direct verification before assuming Tier-Manager-mediated transfer would be materially faster than what vLLM does today.</w:t>
+        <w:t xml:space="preserve">) exists, but was never soak-tested. This needs its own direct verification before assuming Tier-Manager-mediated transfer would be materially faster than what vLLM does today. </w:t>
+      </w:r>
+      <w:r>
+        <w:rPr>
+          <w:rFonts w:ascii="Calibri" w:cs="Calibri" w:eastAsia="Calibri" w:hAnsi="Calibri"/>
+          <w:b/>
+          <w:bCs/>
+        </w:rPr>
+        <w:t xml:space="preserve">Update (2026-08-12):</w:t>
+      </w:r>
+      <w:r>
+        <w:rPr>
+          <w:rFonts w:ascii="Calibri" w:cs="Calibri" w:eastAsia="Calibri" w:hAnsi="Calibri"/>
+        </w:rPr>
+        <w:t xml:space="preserve"> done. 1000 cycles of pin-allocate/H2D/D2H/byte-compare on 256MB shards (Sprint 4, RunPod, real Linux — not WSL2, where this can't be tested at all): 0 mismatches, no timing degradation (pin-alloc time improved -31% after warm-up, total cycle time flat at -1%). Real pinning is safe and stable under sustained load on this platform. Full data: LOGBOOK.md, 2026-08-12 "pinning soak test" entry.</w:t>
       </w:r>
     </w:p>
     <w:p>
@@ -3673,7 +3687,7 @@
         </w:rPr>
         <w:t xml:space="preserve">Issues: </w:t>
       </w:r>
-      <w:hyperlink w:history="1" r:id="rIdfnoscutgd9of8jm7z8rto">
+      <w:hyperlink w:history="1" r:id="rIdtkci4imonnlsbtif9xs6o">
         <w:r>
           <w:rPr>
             <w:rStyle w:val="Hyperlink"/>
@@ -3688,7 +3702,7 @@
         </w:rPr>
         <w:t xml:space="preserve">, </w:t>
       </w:r>
-      <w:hyperlink w:history="1" r:id="rIdrsbo1cu_5wy-ekim5qcg8">
+      <w:hyperlink w:history="1" r:id="rIdchjzakp-h-vlnmqwnm0a8">
         <w:r>
           <w:rPr>
             <w:rStyle w:val="Hyperlink"/>

</xml_diff>

<commit_message>
report: fold Sprint 4 real-Linux reproduction into GCSG report (EN/IT)
- §Abstract, §2.6, new §6.1: cross-hardware/cross-platform reproduction
  (WSL2 411/570 vs real-Linux sliced 412/570 vs real-Linux single-process
  412/570), closing the process-reuse-stall question as a WSL2 artifact.
- New finding: shadow_activations correlates with per-slice latency
  (r=0.95) but not accuracy (r=0.04) — a previously-unmeasured
  performance cost, distinct from the project's quality-only <2% target.
- §7, §9 updated accordingly; both .docx versions regenerated and
  revalidated (well-formed OOXML) to stay in sync with the .md.
</commit_message>
<xml_diff>
--- a/osx-poc/reports/gcsg_shadow_execution_report_EN.docx
+++ b/osx-poc/reports/gcsg_shadow_execution_report_EN.docx
@@ -130,7 +130,21 @@
         <w:rPr>
           <w:rFonts w:ascii="Calibri" w:cs="Calibri" w:eastAsia="Calibri" w:hAnsi="Calibri"/>
         </w:rPr>
-        <w:t xml:space="preserve"> crash shared by two quantization code paths (traced to vLLM's CPU-offload wrapper not covering individually-called expert modules, combined with pageable — not pinned — host memory under WSL2), and a severe, variable-latency slowdown initially mistaken for a deadlock (traced to the same pageable-memory mechanism operating correctly but slowly). Both findings are cross-checked against vLLM's own upstream issue tracker, which confirms the underlying platform limitation is real, structural, and currently unaddressed upstream.</w:t>
+        <w:t xml:space="preserve"> crash shared by two quantization code paths (traced to vLLM's CPU-offload wrapper not covering individually-called expert modules, combined with pageable — not pinned — host memory under WSL2), and a severe, variable-latency slowdown initially mistaken for a deadlock (traced to the same pageable-memory mechanism operating correctly but slowly). Both findings are cross-checked against vLLM's own upstream issue tracker, which confirms the underlying platform limitation is real, structural, and currently unaddressed upstream. </w:t>
+      </w:r>
+      <w:r>
+        <w:rPr>
+          <w:rFonts w:ascii="Calibri" w:cs="Calibri" w:eastAsia="Calibri" w:hAnsi="Calibri"/>
+          <w:b/>
+          <w:bCs/>
+        </w:rPr>
+        <w:t xml:space="preserve">Update (2026-08-12, Sprint 4):</w:t>
+      </w:r>
+      <w:r>
+        <w:rPr>
+          <w:rFonts w:ascii="Calibri" w:cs="Calibri" w:eastAsia="Calibri" w:hAnsi="Calibri"/>
+        </w:rPr>
+        <w:t xml:space="preserve"> the same evaluation reproduced on real Linux (no WSL2) scores 72.28% sliced / 72.3% single-process — matching the original result within noise on different hardware and a different OS/virtualization stack — see §6 and §9.</w:t>
       </w:r>
     </w:p>
     <w:p>
@@ -1304,6 +1318,40 @@
     </w:p>
     <w:p>
       <w:pPr>
+        <w:spacing w:after="160"/>
+      </w:pPr>
+      <w:r>
+        <w:rPr>
+          <w:rFonts w:ascii="Calibri" w:cs="Calibri" w:eastAsia="Calibri" w:hAnsi="Calibri"/>
+          <w:b/>
+          <w:bCs/>
+        </w:rPr>
+        <w:t xml:space="preserve">Update (2026-08-12, Sprint 4):</w:t>
+      </w:r>
+      <w:r>
+        <w:rPr>
+          <w:rFonts w:ascii="Calibri" w:cs="Calibri" w:eastAsia="Calibri" w:hAnsi="Calibri"/>
+        </w:rPr>
+        <w:t xml:space="preserve"> slicing was a WSL2-specific mitigation for §5's slowdown and an additional, never-root-caused stall observed in single-process runs around request 27-31 — not a property of GCSGWorker itself. On real Linux (RunPod, no WSL2, </w:t>
+      </w:r>
+      <w:r>
+        <w:rPr>
+          <w:rFonts w:ascii="Consolas" w:cs="Consolas" w:eastAsia="Consolas" w:hAnsi="Consolas"/>
+          <w:sz w:val="20"/>
+          <w:szCs w:val="20"/>
+          <w:shd w:fill="EFEFEF" w:val="clear"/>
+        </w:rPr>
+        <w:t xml:space="preserve">pin_memory=True</w:t>
+      </w:r>
+      <w:r>
+        <w:rPr>
+          <w:rFonts w:ascii="Calibri" w:cs="Calibri" w:eastAsia="Calibri" w:hAnsi="Calibri"/>
+        </w:rPr>
+        <w:t xml:space="preserve">), the same 570-question evaluation completed in a single process, single model load, without stalling: 570.3s total (106.3s load + 464.0s generate()), scoring 412/570 (72.3%) — statistically the same result as the sliced run on the same platform (412/570, 72.28%) and the original WSL2 run (411/570, 72.11%). This closes the open question: the process-reuse stall was a WSL2 artifact, and slicing is not required on this platform. Full data: LOGBOOK.md, 2026-08-12 "burn-test" entries.</w:t>
+      </w:r>
+    </w:p>
+    <w:p>
+      <w:pPr>
         <w:pStyle w:val="Heading1"/>
         <w:spacing w:after="140" w:before="280"/>
       </w:pPr>
@@ -2098,7 +2146,7 @@
         </w:rPr>
         <w:t xml:space="preserve">, unlike the bypass in §4 — performs its CPU→GPU swap-in over pageable host memory because vLLM disables pinned memory under WSL2. This is slow and highly variable, but not incorrect and not a hang. Cross-checked against vLLM's own upstream issue tracker before accepting a "must be a WSL2 problem" conclusion: </w:t>
       </w:r>
-      <w:hyperlink w:history="1" r:id="rId4elhz2axn13kolpyd521o">
+      <w:hyperlink w:history="1" r:id="rIdlnyyobfkmxk9f5yx-cez0">
         <w:r>
           <w:rPr>
             <w:rStyle w:val="Hyperlink"/>
@@ -2113,7 +2161,7 @@
         </w:rPr>
         <w:t xml:space="preserve"> has a vLLM maintainer stating this is "unavoidable" on WSL, citing NVIDIA's own CUDA-on-WSL documentation; more strikingly, </w:t>
       </w:r>
-      <w:hyperlink w:history="1" r:id="rIdjizzt8zjsoiwt6gjpd0ef">
+      <w:hyperlink w:history="1" r:id="rIdswddvtog3jn23zoi_hos-">
         <w:r>
           <w:rPr>
             <w:rStyle w:val="Hyperlink"/>
@@ -2783,6 +2831,412 @@
     </w:p>
     <w:p>
       <w:pPr>
+        <w:pStyle w:val="Heading2"/>
+        <w:spacing w:after="140" w:before="280"/>
+      </w:pPr>
+      <w:r>
+        <w:t xml:space="preserve">6.1 Cross-Hardware / Cross-Platform Reproduction (2026-08-12, Sprint 4)</w:t>
+      </w:r>
+    </w:p>
+    <w:p>
+      <w:pPr>
+        <w:spacing w:after="160"/>
+      </w:pPr>
+      <w:r>
+        <w:rPr>
+          <w:rFonts w:ascii="Calibri" w:cs="Calibri" w:eastAsia="Calibri" w:hAnsi="Calibri"/>
+        </w:rPr>
+        <w:t xml:space="preserve">The same evaluation was repeated on real Linux (RunPod, RTX A5000, no WSL2), both sliced (matching this section's method) and single-process (§2.6):</w:t>
+      </w:r>
+    </w:p>
+    <w:tbl>
+      <w:tblPr>
+        <w:tblW w:type="dxa" w:w="9360"/>
+        <w:tblBorders>
+          <w:top w:val="single" w:color="auto" w:sz="4"/>
+          <w:left w:val="single" w:color="auto" w:sz="4"/>
+          <w:bottom w:val="single" w:color="auto" w:sz="4"/>
+          <w:right w:val="single" w:color="auto" w:sz="4"/>
+          <w:insideH w:val="single" w:color="auto" w:sz="4"/>
+          <w:insideV w:val="single" w:color="auto" w:sz="4"/>
+        </w:tblBorders>
+      </w:tblPr>
+      <w:tblGrid>
+        <w:gridCol w:w="1800"/>
+        <w:gridCol w:w="2600"/>
+        <w:gridCol w:w="1500"/>
+        <w:gridCol w:w="1500"/>
+        <w:gridCol w:w="1960"/>
+      </w:tblGrid>
+      <w:tr>
+        <w:trPr>
+          <w:tblHeader/>
+        </w:trPr>
+        <w:tc>
+          <w:tcPr>
+            <w:tcW w:type="dxa" w:w="1800"/>
+            <w:shd w:fill="DCE6F1" w:val="clear"/>
+          </w:tcPr>
+          <w:p>
+            <w:r>
+              <w:rPr>
+                <w:rFonts w:ascii="Calibri" w:cs="Calibri" w:eastAsia="Calibri" w:hAnsi="Calibri"/>
+                <w:b/>
+                <w:bCs/>
+              </w:rPr>
+              <w:t xml:space="preserve">Run</w:t>
+            </w:r>
+          </w:p>
+        </w:tc>
+        <w:tc>
+          <w:tcPr>
+            <w:tcW w:type="dxa" w:w="2600"/>
+            <w:shd w:fill="DCE6F1" w:val="clear"/>
+          </w:tcPr>
+          <w:p>
+            <w:r>
+              <w:rPr>
+                <w:rFonts w:ascii="Calibri" w:cs="Calibri" w:eastAsia="Calibri" w:hAnsi="Calibri"/>
+                <w:b/>
+                <w:bCs/>
+              </w:rPr>
+              <w:t xml:space="preserve">Platform</w:t>
+            </w:r>
+          </w:p>
+        </w:tc>
+        <w:tc>
+          <w:tcPr>
+            <w:tcW w:type="dxa" w:w="1500"/>
+            <w:shd w:fill="DCE6F1" w:val="clear"/>
+          </w:tcPr>
+          <w:p>
+            <w:r>
+              <w:rPr>
+                <w:rFonts w:ascii="Calibri" w:cs="Calibri" w:eastAsia="Calibri" w:hAnsi="Calibri"/>
+                <w:b/>
+                <w:bCs/>
+              </w:rPr>
+              <w:t xml:space="preserve">Correct</w:t>
+            </w:r>
+          </w:p>
+        </w:tc>
+        <w:tc>
+          <w:tcPr>
+            <w:tcW w:type="dxa" w:w="1500"/>
+            <w:shd w:fill="DCE6F1" w:val="clear"/>
+          </w:tcPr>
+          <w:p>
+            <w:r>
+              <w:rPr>
+                <w:rFonts w:ascii="Calibri" w:cs="Calibri" w:eastAsia="Calibri" w:hAnsi="Calibri"/>
+                <w:b/>
+                <w:bCs/>
+              </w:rPr>
+              <w:t xml:space="preserve">Accuracy</w:t>
+            </w:r>
+          </w:p>
+        </w:tc>
+        <w:tc>
+          <w:tcPr>
+            <w:tcW w:type="dxa" w:w="1960"/>
+            <w:shd w:fill="DCE6F1" w:val="clear"/>
+          </w:tcPr>
+          <w:p>
+            <w:r>
+              <w:rPr>
+                <w:rFonts w:ascii="Calibri" w:cs="Calibri" w:eastAsia="Calibri" w:hAnsi="Calibri"/>
+                <w:b/>
+                <w:bCs/>
+              </w:rPr>
+              <w:t xml:space="preserve">Wall time</w:t>
+            </w:r>
+          </w:p>
+        </w:tc>
+      </w:tr>
+      <w:tr>
+        <w:tc>
+          <w:tcPr>
+            <w:tcW w:type="dxa" w:w="1800"/>
+          </w:tcPr>
+          <w:p>
+            <w:pPr>
+              <w:spacing w:after="0"/>
+            </w:pPr>
+            <w:r>
+              <w:rPr>
+                <w:rFonts w:ascii="Calibri" w:cs="Calibri" w:eastAsia="Calibri" w:hAnsi="Calibri"/>
+              </w:rPr>
+              <w:t xml:space="preserve">Original</w:t>
+            </w:r>
+          </w:p>
+        </w:tc>
+        <w:tc>
+          <w:tcPr>
+            <w:tcW w:type="dxa" w:w="2600"/>
+          </w:tcPr>
+          <w:p>
+            <w:pPr>
+              <w:spacing w:after="0"/>
+            </w:pPr>
+            <w:r>
+              <w:rPr>
+                <w:rFonts w:ascii="Calibri" w:cs="Calibri" w:eastAsia="Calibri" w:hAnsi="Calibri"/>
+              </w:rPr>
+              <w:t xml:space="preserve">WSL2, RTX 3090</w:t>
+            </w:r>
+          </w:p>
+        </w:tc>
+        <w:tc>
+          <w:tcPr>
+            <w:tcW w:type="dxa" w:w="1500"/>
+          </w:tcPr>
+          <w:p>
+            <w:pPr>
+              <w:spacing w:after="0"/>
+            </w:pPr>
+            <w:r>
+              <w:rPr>
+                <w:rFonts w:ascii="Calibri" w:cs="Calibri" w:eastAsia="Calibri" w:hAnsi="Calibri"/>
+              </w:rPr>
+              <w:t xml:space="preserve">411/570</w:t>
+            </w:r>
+          </w:p>
+        </w:tc>
+        <w:tc>
+          <w:tcPr>
+            <w:tcW w:type="dxa" w:w="1500"/>
+          </w:tcPr>
+          <w:p>
+            <w:pPr>
+              <w:spacing w:after="0"/>
+            </w:pPr>
+            <w:r>
+              <w:rPr>
+                <w:rFonts w:ascii="Calibri" w:cs="Calibri" w:eastAsia="Calibri" w:hAnsi="Calibri"/>
+              </w:rPr>
+              <w:t xml:space="preserve">72.11%</w:t>
+            </w:r>
+          </w:p>
+        </w:tc>
+        <w:tc>
+          <w:tcPr>
+            <w:tcW w:type="dxa" w:w="1960"/>
+          </w:tcPr>
+          <w:p>
+            <w:pPr>
+              <w:spacing w:after="0"/>
+            </w:pPr>
+            <w:r>
+              <w:rPr>
+                <w:rFonts w:ascii="Calibri" w:cs="Calibri" w:eastAsia="Calibri" w:hAnsi="Calibri"/>
+              </w:rPr>
+              <w:t xml:space="preserve">overnight (hours)</w:t>
+            </w:r>
+          </w:p>
+        </w:tc>
+      </w:tr>
+      <w:tr>
+        <w:tc>
+          <w:tcPr>
+            <w:tcW w:type="dxa" w:w="1800"/>
+          </w:tcPr>
+          <w:p>
+            <w:pPr>
+              <w:spacing w:after="0"/>
+            </w:pPr>
+            <w:r>
+              <w:rPr>
+                <w:rFonts w:ascii="Calibri" w:cs="Calibri" w:eastAsia="Calibri" w:hAnsi="Calibri"/>
+              </w:rPr>
+              <w:t xml:space="preserve">Sliced (18×)</w:t>
+            </w:r>
+          </w:p>
+        </w:tc>
+        <w:tc>
+          <w:tcPr>
+            <w:tcW w:type="dxa" w:w="2600"/>
+          </w:tcPr>
+          <w:p>
+            <w:pPr>
+              <w:spacing w:after="0"/>
+            </w:pPr>
+            <w:r>
+              <w:rPr>
+                <w:rFonts w:ascii="Calibri" w:cs="Calibri" w:eastAsia="Calibri" w:hAnsi="Calibri"/>
+              </w:rPr>
+              <w:t xml:space="preserve">Real Linux, RTX A5000</w:t>
+            </w:r>
+          </w:p>
+        </w:tc>
+        <w:tc>
+          <w:tcPr>
+            <w:tcW w:type="dxa" w:w="1500"/>
+          </w:tcPr>
+          <w:p>
+            <w:pPr>
+              <w:spacing w:after="0"/>
+            </w:pPr>
+            <w:r>
+              <w:rPr>
+                <w:rFonts w:ascii="Calibri" w:cs="Calibri" w:eastAsia="Calibri" w:hAnsi="Calibri"/>
+              </w:rPr>
+              <w:t xml:space="preserve">412/570</w:t>
+            </w:r>
+          </w:p>
+        </w:tc>
+        <w:tc>
+          <w:tcPr>
+            <w:tcW w:type="dxa" w:w="1500"/>
+          </w:tcPr>
+          <w:p>
+            <w:pPr>
+              <w:spacing w:after="0"/>
+            </w:pPr>
+            <w:r>
+              <w:rPr>
+                <w:rFonts w:ascii="Calibri" w:cs="Calibri" w:eastAsia="Calibri" w:hAnsi="Calibri"/>
+              </w:rPr>
+              <w:t xml:space="preserve">72.28%</w:t>
+            </w:r>
+          </w:p>
+        </w:tc>
+        <w:tc>
+          <w:tcPr>
+            <w:tcW w:type="dxa" w:w="1960"/>
+          </w:tcPr>
+          <w:p>
+            <w:pPr>
+              <w:spacing w:after="0"/>
+            </w:pPr>
+            <w:r>
+              <w:rPr>
+                <w:rFonts w:ascii="Calibri" w:cs="Calibri" w:eastAsia="Calibri" w:hAnsi="Calibri"/>
+              </w:rPr>
+              <w:t xml:space="preserve">~38-40 min</w:t>
+            </w:r>
+          </w:p>
+        </w:tc>
+      </w:tr>
+      <w:tr>
+        <w:tc>
+          <w:tcPr>
+            <w:tcW w:type="dxa" w:w="1800"/>
+          </w:tcPr>
+          <w:p>
+            <w:pPr>
+              <w:spacing w:after="0"/>
+            </w:pPr>
+            <w:r>
+              <w:rPr>
+                <w:rFonts w:ascii="Calibri" w:cs="Calibri" w:eastAsia="Calibri" w:hAnsi="Calibri"/>
+              </w:rPr>
+              <w:t xml:space="preserve">Single-process</w:t>
+            </w:r>
+          </w:p>
+        </w:tc>
+        <w:tc>
+          <w:tcPr>
+            <w:tcW w:type="dxa" w:w="2600"/>
+          </w:tcPr>
+          <w:p>
+            <w:pPr>
+              <w:spacing w:after="0"/>
+            </w:pPr>
+            <w:r>
+              <w:rPr>
+                <w:rFonts w:ascii="Calibri" w:cs="Calibri" w:eastAsia="Calibri" w:hAnsi="Calibri"/>
+              </w:rPr>
+              <w:t xml:space="preserve">Real Linux, RTX A5000</w:t>
+            </w:r>
+          </w:p>
+        </w:tc>
+        <w:tc>
+          <w:tcPr>
+            <w:tcW w:type="dxa" w:w="1500"/>
+          </w:tcPr>
+          <w:p>
+            <w:pPr>
+              <w:spacing w:after="0"/>
+            </w:pPr>
+            <w:r>
+              <w:rPr>
+                <w:rFonts w:ascii="Calibri" w:cs="Calibri" w:eastAsia="Calibri" w:hAnsi="Calibri"/>
+              </w:rPr>
+              <w:t xml:space="preserve">412/570</w:t>
+            </w:r>
+          </w:p>
+        </w:tc>
+        <w:tc>
+          <w:tcPr>
+            <w:tcW w:type="dxa" w:w="1500"/>
+          </w:tcPr>
+          <w:p>
+            <w:pPr>
+              <w:spacing w:after="0"/>
+            </w:pPr>
+            <w:r>
+              <w:rPr>
+                <w:rFonts w:ascii="Calibri" w:cs="Calibri" w:eastAsia="Calibri" w:hAnsi="Calibri"/>
+              </w:rPr>
+              <w:t xml:space="preserve">72.3%</w:t>
+            </w:r>
+          </w:p>
+        </w:tc>
+        <w:tc>
+          <w:tcPr>
+            <w:tcW w:type="dxa" w:w="1960"/>
+          </w:tcPr>
+          <w:p>
+            <w:pPr>
+              <w:spacing w:after="0"/>
+            </w:pPr>
+            <w:r>
+              <w:rPr>
+                <w:rFonts w:ascii="Calibri" w:cs="Calibri" w:eastAsia="Calibri" w:hAnsi="Calibri"/>
+              </w:rPr>
+              <w:t xml:space="preserve">9.5 min</w:t>
+            </w:r>
+          </w:p>
+        </w:tc>
+      </w:tr>
+    </w:tbl>
+    <w:p>
+      <w:pPr>
+        <w:spacing w:after="120"/>
+      </w:pPr>
+    </w:p>
+    <w:p>
+      <w:pPr>
+        <w:spacing w:after="160"/>
+      </w:pPr>
+      <w:r>
+        <w:rPr>
+          <w:rFonts w:ascii="Calibri" w:cs="Calibri" w:eastAsia="Calibri" w:hAnsi="Calibri"/>
+        </w:rPr>
+        <w:t xml:space="preserve">All three agree within noise on a 570-question sample. This is evidence the pipeline's quality behavior is stable across GPU generation, driver stack, and OS/virtualization layer — not a claim of statistical significance (§7 still applies: three runs, not a distribution).</w:t>
+      </w:r>
+    </w:p>
+    <w:p>
+      <w:pPr>
+        <w:spacing w:after="160"/>
+      </w:pPr>
+      <w:r>
+        <w:rPr>
+          <w:rFonts w:ascii="Calibri" w:cs="Calibri" w:eastAsia="Calibri" w:hAnsi="Calibri"/>
+          <w:b/>
+          <w:bCs/>
+        </w:rPr>
+        <w:t xml:space="preserve">New finding — shadow-execution activation rate correlates with latency, not accuracy.</w:t>
+      </w:r>
+      <w:r>
+        <w:rPr>
+          <w:rFonts w:ascii="Calibri" w:cs="Calibri" w:eastAsia="Calibri" w:hAnsi="Calibri"/>
+        </w:rPr>
+        <w:t xml:space="preserve"> Per-slice shadow_activations vs. per-slice accuracy: r=0.04 (no relationship — contamination doesn't selectively degrade high-activation slices). Per-slice shadow_activations vs. per-slice wall time: r=0.95 (strong) — the four slowest slices in the sliced run were exactly the four with 3-4× the typical activation count, consistent with each shadow activation being an extra forward pass through the INT4 verification expert. This is a real, previously-unmeasured performance cost of shadow execution, distinct from the quality-cost figures this report otherwise focuses on — see §9.</w:t>
+      </w:r>
+    </w:p>
+    <w:p>
+      <w:pPr>
         <w:pStyle w:val="Heading1"/>
         <w:spacing w:after="140" w:before="280"/>
       </w:pPr>
@@ -2884,13 +3338,13 @@
           <w:b/>
           <w:bCs/>
         </w:rPr>
-        <w:t xml:space="preserve">Single run, no statistical repetition.</w:t>
-      </w:r>
-      <w:r>
-        <w:rPr>
-          <w:rFonts w:ascii="Calibri" w:cs="Calibri" w:eastAsia="Calibri" w:hAnsi="Calibri"/>
-        </w:rPr>
-        <w:t xml:space="preserve"> The 72.11% figure is one overnight run. Earlier benchmark work on this same hardware (M1 </w:t>
+        <w:t xml:space="preserve">Still no formal confidence interval, despite now three runs.</w:t>
+      </w:r>
+      <w:r>
+        <w:rPr>
+          <w:rFonts w:ascii="Calibri" w:cs="Calibri" w:eastAsia="Calibri" w:hAnsi="Calibri"/>
+        </w:rPr>
+        <w:t xml:space="preserve"> The original 72.11% figure was one overnight run; two more full runs on different hardware/OS (§6.1: 72.28% sliced, 72.3% single-process, both real Linux) landed within noise of it. That is evidence of cross-platform stability, not a substitute for repeated runs on fixed hardware to establish a real confidence interval — the three runs differ in platform, not just in random seed. Earlier benchmark work on this same hardware (M1 </w:t>
       </w:r>
       <w:r>
         <w:rPr>
@@ -2905,7 +3359,7 @@
         <w:rPr>
           <w:rFonts w:ascii="Calibri" w:cs="Calibri" w:eastAsia="Calibri" w:hAnsi="Calibri"/>
         </w:rPr>
-        <w:t xml:space="preserve">) observed ~32% run-to-run variance on unrelated timing metrics with no code change — accuracy is a different, more discrete metric, but repeated full runs have not been done to establish a confidence interval here.</w:t>
+        <w:t xml:space="preserve">) observed ~32% run-to-run variance on unrelated timing metrics with no code change — accuracy is a different, more discrete metric, but a proper repeated-runs interval still has not been established.</w:t>
       </w:r>
     </w:p>
     <w:p>
@@ -2998,7 +3452,7 @@
         </w:numPr>
         <w:spacing w:after="80"/>
       </w:pPr>
-      <w:hyperlink w:history="1" r:id="rId15cuwzd5xns2cr6ra9wxn">
+      <w:hyperlink w:history="1" r:id="rIdoxenrztajbzjespxff7cg">
         <w:r>
           <w:rPr>
             <w:rStyle w:val="Hyperlink"/>
@@ -3023,7 +3477,7 @@
         </w:numPr>
         <w:spacing w:after="80"/>
       </w:pPr>
-      <w:hyperlink w:history="1" r:id="rId56k_onzhyftax-6faf5_d">
+      <w:hyperlink w:history="1" r:id="rId586hcgoskgkwf8qj-wlec">
         <w:r>
           <w:rPr>
             <w:rStyle w:val="Hyperlink"/>
@@ -3322,7 +3776,21 @@
         <w:rPr>
           <w:rFonts w:ascii="Calibri" w:cs="Calibri" w:eastAsia="Calibri" w:hAnsi="Calibri"/>
         </w:rPr>
-        <w:t xml:space="preserve">Repeat this same MMLU evaluation on that path once it exists, as the next data point against this report's baseline.</w:t>
+        <w:t xml:space="preserve">Repeat this same MMLU evaluation on that path once it exists, as the next data point against this report's baseline. </w:t>
+      </w:r>
+      <w:r>
+        <w:rPr>
+          <w:rFonts w:ascii="Calibri" w:cs="Calibri" w:eastAsia="Calibri" w:hAnsi="Calibri"/>
+          <w:b/>
+          <w:bCs/>
+        </w:rPr>
+        <w:t xml:space="preserve">Update (2026-08-12):</w:t>
+      </w:r>
+      <w:r>
+        <w:rPr>
+          <w:rFonts w:ascii="Calibri" w:cs="Calibri" w:eastAsia="Calibri" w:hAnsi="Calibri"/>
+        </w:rPr>
+        <w:t xml:space="preserve"> partially superseded — see §6.1. The evaluation was repeated on real Linux (not the Tier-Manager-routed path, which still doesn't exist) and reproduced within noise (72.28%/72.3% vs. 72.11%), confirming the result isn't an artifact of the original WSL2 run specifically. The Tier-Manager-routed rerun (the original intent of this item) remains open — tracked as issue #17.</w:t>
       </w:r>
     </w:p>
     <w:p>
@@ -3374,6 +3842,54 @@
     </w:p>
     <w:p>
       <w:pPr>
+        <w:pStyle w:val="ListParagraph"/>
+        <w:numPr>
+          <w:ilvl w:val="0"/>
+          <w:numId w:val="3"/>
+        </w:numPr>
+        <w:spacing w:after="80"/>
+      </w:pPr>
+      <w:r>
+        <w:rPr>
+          <w:rFonts w:ascii="Calibri" w:cs="Calibri" w:eastAsia="Calibri" w:hAnsi="Calibri"/>
+          <w:b/>
+          <w:bCs/>
+        </w:rPr>
+        <w:t xml:space="preserve">New (2026-08-12):</w:t>
+      </w:r>
+      <w:r>
+        <w:rPr>
+          <w:rFonts w:ascii="Calibri" w:cs="Calibri" w:eastAsia="Calibri" w:hAnsi="Calibri"/>
+        </w:rPr>
+        <w:t xml:space="preserve"> quantify and, if worthwhile, reduce the latency cost of shadow execution itself. §6.1 found per-slice wall time strongly tracks activation count (r=0.95) — each activation is an extra forward pass through the INT4 verification expert. The project's &lt;2% target has only ever been a quality budget; this is a first measurement of the performance side, not yet bounded by any stated target or optimized against.</w:t>
+      </w:r>
+    </w:p>
+    <w:p>
+      <w:pPr>
+        <w:pStyle w:val="ListParagraph"/>
+        <w:numPr>
+          <w:ilvl w:val="0"/>
+          <w:numId w:val="3"/>
+        </w:numPr>
+        <w:spacing w:after="80"/>
+      </w:pPr>
+      <w:r>
+        <w:rPr>
+          <w:rFonts w:ascii="Calibri" w:cs="Calibri" w:eastAsia="Calibri" w:hAnsi="Calibri"/>
+          <w:b/>
+          <w:bCs/>
+        </w:rPr>
+        <w:t xml:space="preserve">New (2026-08-12):</w:t>
+      </w:r>
+      <w:r>
+        <w:rPr>
+          <w:rFonts w:ascii="Calibri" w:cs="Calibri" w:eastAsia="Calibri" w:hAnsi="Calibri"/>
+        </w:rPr>
+        <w:t xml:space="preserve"> the fresh-process-per-slice orchestration (§2.6) was a WSL2-specific workaround for an undiagnosed stall and is confirmed unnecessary on real Linux (§2.6 update) — a single process completed all 570 questions cleanly. On platforms without that constraint, single-process evaluation is simpler and ~4× faster wall-clock (9.5 min vs. ~38-40 min for the same result) purely from avoiding 18× redundant model loads.</w:t>
+      </w:r>
+    </w:p>
+    <w:p>
+      <w:pPr>
         <w:pStyle w:val="Heading1"/>
         <w:spacing w:after="140" w:before="280"/>
       </w:pPr>
@@ -3687,7 +4203,7 @@
         </w:rPr>
         <w:t xml:space="preserve">Issues: </w:t>
       </w:r>
-      <w:hyperlink w:history="1" r:id="rIdtkci4imonnlsbtif9xs6o">
+      <w:hyperlink w:history="1" r:id="rIdimebxofxpkauga0j1h8qg">
         <w:r>
           <w:rPr>
             <w:rStyle w:val="Hyperlink"/>
@@ -3702,7 +4218,7 @@
         </w:rPr>
         <w:t xml:space="preserve">, </w:t>
       </w:r>
-      <w:hyperlink w:history="1" r:id="rIdchjzakp-h-vlnmqwnm0a8">
+      <w:hyperlink w:history="1" r:id="rIdmitnvzeba5tacxydjtgtj">
         <w:r>
           <w:rPr>
             <w:rStyle w:val="Hyperlink"/>

</xml_diff>